<commit_message>
Update Data Untuk Sidang
</commit_message>
<xml_diff>
--- a/Hasil Wawancara/Denny Satria - Quranic Farm.docx
+++ b/Hasil Wawancara/Denny Satria - Quranic Farm.docx
@@ -4,7 +4,7 @@
   <w:body>
     <w:tbl>
       <w:tblPr>
-        <w:tblStyle w:val="TableGrid"/>
+        <w:tblStyle w:val="KisiTabel"/>
         <w:tblW w:w="8154" w:type="dxa"/>
         <w:jc w:val="center"/>
         <w:tblLayout w:type="fixed"/>
@@ -1949,239 +1949,72 @@
         </w:rPr>
       </w:pPr>
     </w:p>
-    <w:tbl>
-      <w:tblPr>
-        <w:tblW w:w="8212" w:type="dxa"/>
-        <w:jc w:val="center"/>
-        <w:tblBorders>
-          <w:top w:val="single" w:sz="4" w:space="0" w:color="000000"/>
-          <w:left w:val="single" w:sz="4" w:space="0" w:color="000000"/>
-          <w:bottom w:val="single" w:sz="4" w:space="0" w:color="000000"/>
-          <w:right w:val="single" w:sz="4" w:space="0" w:color="000000"/>
-          <w:insideH w:val="single" w:sz="4" w:space="0" w:color="000000"/>
-          <w:insideV w:val="single" w:sz="4" w:space="0" w:color="000000"/>
-        </w:tblBorders>
-        <w:tblLayout w:type="fixed"/>
-        <w:tblLook w:val="0400" w:firstRow="0" w:lastRow="0" w:firstColumn="0" w:lastColumn="0" w:noHBand="0" w:noVBand="1"/>
-      </w:tblPr>
-      <w:tblGrid>
-        <w:gridCol w:w="4106"/>
-        <w:gridCol w:w="4106"/>
-      </w:tblGrid>
-      <w:tr>
-        <w:trPr>
-          <w:trHeight w:val="283"/>
-          <w:jc w:val="center"/>
-        </w:trPr>
-        <w:tc>
-          <w:tcPr>
-            <w:tcW w:w="4106" w:type="dxa"/>
-            <w:shd w:val="clear" w:color="auto" w:fill="D9D9D9"/>
-            <w:vAlign w:val="center"/>
-          </w:tcPr>
-          <w:p>
-            <w:pPr>
-              <w:spacing w:after="0"/>
-              <w:jc w:val="center"/>
-              <w:rPr>
-                <w:rFonts w:ascii="Arial" w:hAnsi="Arial" w:cs="Arial"/>
-                <w:b/>
-              </w:rPr>
-            </w:pPr>
-            <w:r>
-              <w:rPr>
-                <w:rFonts w:ascii="Arial" w:hAnsi="Arial" w:cs="Arial"/>
-                <w:b/>
-              </w:rPr>
-              <w:t>Mahasiswa</w:t>
-            </w:r>
-          </w:p>
-        </w:tc>
-        <w:tc>
-          <w:tcPr>
-            <w:tcW w:w="4106" w:type="dxa"/>
-            <w:shd w:val="clear" w:color="auto" w:fill="D9D9D9"/>
-            <w:vAlign w:val="center"/>
-          </w:tcPr>
-          <w:p>
-            <w:pPr>
-              <w:spacing w:after="0"/>
-              <w:jc w:val="center"/>
-              <w:rPr>
-                <w:rFonts w:ascii="Arial" w:hAnsi="Arial" w:cs="Arial"/>
-                <w:b/>
-              </w:rPr>
-            </w:pPr>
-            <w:r>
-              <w:rPr>
-                <w:rFonts w:ascii="Arial" w:hAnsi="Arial" w:cs="Arial"/>
-                <w:b/>
-              </w:rPr>
-              <w:t>Narasumber</w:t>
-            </w:r>
-          </w:p>
-        </w:tc>
-      </w:tr>
-      <w:tr>
-        <w:trPr>
-          <w:trHeight w:val="1919"/>
-          <w:jc w:val="center"/>
-        </w:trPr>
-        <w:tc>
-          <w:tcPr>
-            <w:tcW w:w="4106" w:type="dxa"/>
-          </w:tcPr>
-          <w:p>
-            <w:pPr>
-              <w:spacing w:line="276" w:lineRule="auto"/>
-              <w:rPr>
-                <w:rFonts w:ascii="Arial" w:hAnsi="Arial" w:cs="Arial"/>
-              </w:rPr>
-            </w:pPr>
-          </w:p>
-          <w:p>
-            <w:pPr>
-              <w:spacing w:line="276" w:lineRule="auto"/>
-              <w:rPr>
-                <w:rFonts w:ascii="Arial" w:hAnsi="Arial" w:cs="Arial"/>
-              </w:rPr>
-            </w:pPr>
-          </w:p>
-          <w:p>
-            <w:pPr>
-              <w:spacing w:line="276" w:lineRule="auto"/>
-              <w:jc w:val="center"/>
-              <w:rPr>
-                <w:rFonts w:ascii="Arial" w:hAnsi="Arial" w:cs="Arial"/>
-              </w:rPr>
-            </w:pPr>
-          </w:p>
-          <w:p>
-            <w:pPr>
-              <w:spacing w:line="276" w:lineRule="auto"/>
-              <w:jc w:val="center"/>
-              <w:rPr>
-                <w:rFonts w:ascii="Arial" w:hAnsi="Arial" w:cs="Arial"/>
-              </w:rPr>
-            </w:pPr>
-          </w:p>
-          <w:p>
-            <w:pPr>
-              <w:spacing w:line="276" w:lineRule="auto"/>
-              <w:jc w:val="center"/>
-              <w:rPr>
-                <w:rFonts w:ascii="Arial" w:hAnsi="Arial" w:cs="Arial"/>
-              </w:rPr>
-            </w:pPr>
-            <w:r>
-              <w:rPr>
-                <w:rFonts w:ascii="Arial" w:hAnsi="Arial" w:cs="Arial"/>
-              </w:rPr>
-              <w:t>_____________________</w:t>
-            </w:r>
-            <w:r>
-              <w:rPr>
-                <w:rFonts w:ascii="Arial" w:hAnsi="Arial" w:cs="Arial"/>
-              </w:rPr>
-              <w:br/>
-            </w:r>
-            <w:r>
-              <w:rPr>
-                <w:rFonts w:ascii="Arial" w:hAnsi="Arial" w:cs="Arial"/>
-                <w:sz w:val="20"/>
-                <w:szCs w:val="20"/>
-              </w:rPr>
-              <w:t>Kevin Pratama</w:t>
-            </w:r>
-          </w:p>
-        </w:tc>
-        <w:tc>
-          <w:tcPr>
-            <w:tcW w:w="4106" w:type="dxa"/>
-          </w:tcPr>
-          <w:p>
-            <w:pPr>
-              <w:spacing w:line="276" w:lineRule="auto"/>
-              <w:rPr>
-                <w:rFonts w:ascii="Arial" w:hAnsi="Arial" w:cs="Arial"/>
-              </w:rPr>
-            </w:pPr>
-          </w:p>
-          <w:p>
-            <w:pPr>
-              <w:spacing w:line="276" w:lineRule="auto"/>
-              <w:rPr>
-                <w:rFonts w:ascii="Arial" w:hAnsi="Arial" w:cs="Arial"/>
-              </w:rPr>
-            </w:pPr>
-          </w:p>
-          <w:p>
-            <w:pPr>
-              <w:spacing w:line="276" w:lineRule="auto"/>
-              <w:jc w:val="center"/>
-              <w:rPr>
-                <w:rFonts w:ascii="Arial" w:hAnsi="Arial" w:cs="Arial"/>
-              </w:rPr>
-            </w:pPr>
-          </w:p>
-          <w:p>
-            <w:pPr>
-              <w:spacing w:line="276" w:lineRule="auto"/>
-              <w:jc w:val="center"/>
-              <w:rPr>
-                <w:rFonts w:ascii="Arial" w:hAnsi="Arial" w:cs="Arial"/>
-              </w:rPr>
-            </w:pPr>
-          </w:p>
-          <w:p>
-            <w:pPr>
-              <w:spacing w:after="0" w:line="276" w:lineRule="auto"/>
-              <w:jc w:val="center"/>
-              <w:rPr>
-                <w:rFonts w:ascii="Arial" w:hAnsi="Arial" w:cs="Arial"/>
-              </w:rPr>
-            </w:pPr>
-            <w:r>
-              <w:rPr>
-                <w:rFonts w:ascii="Arial" w:hAnsi="Arial" w:cs="Arial"/>
-              </w:rPr>
-              <w:t>_____________________</w:t>
-            </w:r>
-          </w:p>
-          <w:p>
-            <w:pPr>
-              <w:spacing w:line="276" w:lineRule="auto"/>
-              <w:jc w:val="center"/>
-              <w:rPr>
-                <w:rFonts w:ascii="Arial" w:hAnsi="Arial" w:cs="Arial"/>
-              </w:rPr>
-            </w:pPr>
-            <w:r>
-              <w:rPr>
-                <w:rFonts w:ascii="Arial" w:hAnsi="Arial" w:cs="Arial"/>
-                <w:sz w:val="20"/>
-                <w:szCs w:val="20"/>
-              </w:rPr>
-              <w:t>Denny Satria Mandala Putra</w:t>
-            </w:r>
-          </w:p>
-        </w:tc>
-      </w:tr>
-    </w:tbl>
     <w:p>
       <w:pPr>
-        <w:spacing w:after="0" w:line="240" w:lineRule="auto"/>
-      </w:pPr>
-    </w:p>
-    <w:p>
-      <w:pPr>
+        <w:jc w:val="center"/>
         <w:rPr>
           <w:lang w:val="en-US"/>
         </w:rPr>
       </w:pPr>
+      <w:r>
+        <w:rPr>
+          <w:noProof/>
+        </w:rPr>
+        <w:drawing>
+          <wp:inline distT="0" distB="0" distL="0" distR="0" wp14:anchorId="46FE83BE" wp14:editId="1CB0F062">
+            <wp:extent cx="4992459" cy="1828800"/>
+            <wp:effectExtent l="0" t="0" r="0" b="0"/>
+            <wp:docPr id="622625188" name="Gambar 2"/>
+            <wp:cNvGraphicFramePr>
+              <a:graphicFrameLocks xmlns:a="http://schemas.openxmlformats.org/drawingml/2006/main" noChangeAspect="1"/>
+            </wp:cNvGraphicFramePr>
+            <a:graphic xmlns:a="http://schemas.openxmlformats.org/drawingml/2006/main">
+              <a:graphicData uri="http://schemas.openxmlformats.org/drawingml/2006/picture">
+                <pic:pic xmlns:pic="http://schemas.openxmlformats.org/drawingml/2006/picture">
+                  <pic:nvPicPr>
+                    <pic:cNvPr id="0" name="Picture 3"/>
+                    <pic:cNvPicPr>
+                      <a:picLocks noChangeAspect="1" noChangeArrowheads="1"/>
+                    </pic:cNvPicPr>
+                  </pic:nvPicPr>
+                  <pic:blipFill rotWithShape="1">
+                    <a:blip r:embed="rId6">
+                      <a:extLst>
+                        <a:ext uri="{28A0092B-C50C-407E-A947-70E740481C1C}">
+                          <a14:useLocalDpi xmlns:a14="http://schemas.microsoft.com/office/drawing/2010/main" val="0"/>
+                        </a:ext>
+                      </a:extLst>
+                    </a:blip>
+                    <a:srcRect l="9901" t="69871" r="4518" b="1786"/>
+                    <a:stretch/>
+                  </pic:blipFill>
+                  <pic:spPr bwMode="auto">
+                    <a:xfrm>
+                      <a:off x="0" y="0"/>
+                      <a:ext cx="5004700" cy="1833284"/>
+                    </a:xfrm>
+                    <a:prstGeom prst="rect">
+                      <a:avLst/>
+                    </a:prstGeom>
+                    <a:noFill/>
+                    <a:ln>
+                      <a:noFill/>
+                    </a:ln>
+                    <a:extLst>
+                      <a:ext uri="{53640926-AAD7-44D8-BBD7-CCE9431645EC}">
+                        <a14:shadowObscured xmlns:a14="http://schemas.microsoft.com/office/drawing/2010/main"/>
+                      </a:ext>
+                    </a:extLst>
+                  </pic:spPr>
+                </pic:pic>
+              </a:graphicData>
+            </a:graphic>
+          </wp:inline>
+        </w:drawing>
+      </w:r>
     </w:p>
     <w:sectPr>
-      <w:headerReference w:type="default" r:id="rId6"/>
+      <w:headerReference w:type="default" r:id="rId7"/>
       <w:pgSz w:w="11906" w:h="16838"/>
       <w:pgMar w:top="2268" w:right="1701" w:bottom="1701" w:left="2268" w:header="1417" w:footer="850" w:gutter="0"/>
       <w:cols w:space="708"/>
@@ -2679,13 +2512,13 @@
       <w:lang w:val="id-ID"/>
     </w:rPr>
   </w:style>
-  <w:style w:type="character" w:default="1" w:styleId="DefaultParagraphFont">
+  <w:style w:type="character" w:default="1" w:styleId="FontParagrafDefault">
     <w:name w:val="Default Paragraph Font"/>
     <w:uiPriority w:val="1"/>
     <w:semiHidden/>
     <w:unhideWhenUsed/>
   </w:style>
-  <w:style w:type="table" w:default="1" w:styleId="TableNormal">
+  <w:style w:type="table" w:default="1" w:styleId="TabelNormal">
     <w:name w:val="Normal Table"/>
     <w:uiPriority w:val="99"/>
     <w:semiHidden/>
@@ -2700,7 +2533,7 @@
       </w:tblCellMar>
     </w:tblPr>
   </w:style>
-  <w:style w:type="numbering" w:default="1" w:styleId="NoList">
+  <w:style w:type="numbering" w:default="1" w:styleId="TidakAdaDaftar">
     <w:name w:val="No List"/>
     <w:uiPriority w:val="99"/>
     <w:semiHidden/>
@@ -2709,7 +2542,7 @@
   <w:style w:type="paragraph" w:styleId="Header">
     <w:name w:val="header"/>
     <w:basedOn w:val="Normal"/>
-    <w:link w:val="HeaderChar"/>
+    <w:link w:val="HeaderKAR"/>
     <w:uiPriority w:val="99"/>
     <w:unhideWhenUsed/>
     <w:rsid w:val="00033AA3"/>
@@ -2721,9 +2554,9 @@
       <w:spacing w:after="0" w:line="240" w:lineRule="auto"/>
     </w:pPr>
   </w:style>
-  <w:style w:type="character" w:customStyle="1" w:styleId="HeaderChar">
-    <w:name w:val="Header Char"/>
-    <w:basedOn w:val="DefaultParagraphFont"/>
+  <w:style w:type="character" w:customStyle="1" w:styleId="HeaderKAR">
+    <w:name w:val="Header KAR"/>
+    <w:basedOn w:val="FontParagrafDefault"/>
     <w:link w:val="Header"/>
     <w:uiPriority w:val="99"/>
     <w:rsid w:val="00033AA3"/>
@@ -2734,7 +2567,7 @@
   <w:style w:type="paragraph" w:styleId="Footer">
     <w:name w:val="footer"/>
     <w:basedOn w:val="Normal"/>
-    <w:link w:val="FooterChar"/>
+    <w:link w:val="FooterKAR"/>
     <w:uiPriority w:val="99"/>
     <w:unhideWhenUsed/>
     <w:rsid w:val="00033AA3"/>
@@ -2746,9 +2579,9 @@
       <w:spacing w:after="0" w:line="240" w:lineRule="auto"/>
     </w:pPr>
   </w:style>
-  <w:style w:type="character" w:customStyle="1" w:styleId="FooterChar">
-    <w:name w:val="Footer Char"/>
-    <w:basedOn w:val="DefaultParagraphFont"/>
+  <w:style w:type="character" w:customStyle="1" w:styleId="FooterKAR">
+    <w:name w:val="Footer KAR"/>
+    <w:basedOn w:val="FontParagrafDefault"/>
     <w:link w:val="Footer"/>
     <w:uiPriority w:val="99"/>
     <w:rsid w:val="00033AA3"/>
@@ -2756,9 +2589,9 @@
       <w:lang w:val="id-ID"/>
     </w:rPr>
   </w:style>
-  <w:style w:type="table" w:styleId="TableGrid">
+  <w:style w:type="table" w:styleId="KisiTabel">
     <w:name w:val="Table Grid"/>
-    <w:basedOn w:val="TableNormal"/>
+    <w:basedOn w:val="TabelNormal"/>
     <w:uiPriority w:val="39"/>
     <w:rsid w:val="00033AA3"/>
     <w:pPr>
@@ -2775,7 +2608,7 @@
       </w:tblBorders>
     </w:tblPr>
   </w:style>
-  <w:style w:type="paragraph" w:styleId="ListParagraph">
+  <w:style w:type="paragraph" w:styleId="DaftarParagraf">
     <w:name w:val="List Paragraph"/>
     <w:basedOn w:val="Normal"/>
     <w:uiPriority w:val="34"/>

</xml_diff>